<commit_message>
Added 10-32, IBM shares
</commit_message>
<xml_diff>
--- a/Chapter 10/Exercises/10 Exercises.docx
+++ b/Chapter 10/Exercises/10 Exercises.docx
@@ -33,7 +33,7 @@
           <w:rFonts w:ascii="Lucida Console" w:hAnsi="Lucida Console"/>
           <w:lang w:val="en-US"/>
         </w:rPr>
-        <w:t>To find the number of shares that are issued and outstanding, we note that the total number of issued shares are 2 million and out of them, 0.375 million shares are in treasury, meaning that they are bought back by the company and hence, are not outstanding.</w:t>
+        <w:t>For the IBM corporation, the calculations are done as follows:</w:t>
       </w:r>
     </w:p>
     <w:p>
@@ -48,7 +48,7 @@
           <w:rFonts w:ascii="Lucida Console" w:hAnsi="Lucida Console"/>
           <w:lang w:val="en-US"/>
         </w:rPr>
-        <w:t>Thus, the total shares that are issued and outstanding are 2 – 0.375 = 1,625,000 shares.</w:t>
+        <w:t>Issued shares = 2,182.5 million</w:t>
       </w:r>
     </w:p>
     <w:p>
@@ -58,6 +58,13 @@
           <w:lang w:val="en-US"/>
         </w:rPr>
       </w:pPr>
+      <w:r>
+        <w:rPr>
+          <w:rFonts w:ascii="Lucida Console" w:hAnsi="Lucida Console"/>
+          <w:lang w:val="en-US"/>
+        </w:rPr>
+        <w:t>Shares held in treasury = 1,019.3 million</w:t>
+      </w:r>
     </w:p>
     <w:p>
       <w:pPr>
@@ -71,7 +78,37 @@
           <w:rFonts w:ascii="Lucida Console" w:hAnsi="Lucida Console"/>
           <w:lang w:val="en-US"/>
         </w:rPr>
-        <w:t>The total number of authorized shares are 3.5 million, out of which 2 million are declared issued. Thus, the number of unissued shares will be given by 1.5 million.</w:t>
+        <w:t>Thus, the number of shares that are issued and outstanding are given by 2,182.5 – 1,019.3 = 1,163.2 million.</w:t>
+      </w:r>
+    </w:p>
+    <w:p>
+      <w:pPr>
+        <w:rPr>
+          <w:rFonts w:ascii="Lucida Console" w:hAnsi="Lucida Console"/>
+          <w:lang w:val="en-US"/>
+        </w:rPr>
+      </w:pPr>
+      <w:r>
+        <w:rPr>
+          <w:rFonts w:ascii="Lucida Console" w:hAnsi="Lucida Console"/>
+          <w:lang w:val="en-US"/>
+        </w:rPr>
+        <w:t>Further, there are 4,687.5 million shares authorized.</w:t>
+      </w:r>
+    </w:p>
+    <w:p>
+      <w:pPr>
+        <w:rPr>
+          <w:rFonts w:ascii="Lucida Console" w:hAnsi="Lucida Console"/>
+          <w:lang w:val="en-US"/>
+        </w:rPr>
+      </w:pPr>
+      <w:r>
+        <w:rPr>
+          <w:rFonts w:ascii="Lucida Console" w:hAnsi="Lucida Console"/>
+          <w:lang w:val="en-US"/>
+        </w:rPr>
+        <w:t>Thus, the total number of unissued shares are given by 4,687.5 – 2,182.5 = 2,505 million shares.</w:t>
       </w:r>
     </w:p>
     <w:p>

</xml_diff>